<commit_message>
First fully working GUI application
</commit_message>
<xml_diff>
--- a/02_rendezett.docx
+++ b/02_rendezett.docx
@@ -8799,7 +8799,7 @@
           <v:shape id="_x0000_i1025" type="#_x0000_t75" style="width:10.5pt;height:30.5pt" o:ole="">
             <v:imagedata r:id="rId4" o:title=""/>
           </v:shape>
-          <o:OLEObject Type="Embed" ProgID="Equation.3" ShapeID="_x0000_i1025" DrawAspect="Content" ObjectID="_1845276765" r:id="rId5"/>
+          <o:OLEObject Type="Embed" ProgID="Equation.3" ShapeID="_x0000_i1025" DrawAspect="Content" ObjectID="_1845288666" r:id="rId5"/>
         </w:object>
       </w:r>
       <w:r>
@@ -9313,7 +9313,7 @@
           <v:shape id="_x0000_i1026" type="#_x0000_t75" style="width:10.5pt;height:30.5pt" o:ole="">
             <v:imagedata r:id="rId6" o:title=""/>
           </v:shape>
-          <o:OLEObject Type="Embed" ProgID="Equation.3" ShapeID="_x0000_i1026" DrawAspect="Content" ObjectID="_1845276766" r:id="rId7"/>
+          <o:OLEObject Type="Embed" ProgID="Equation.3" ShapeID="_x0000_i1026" DrawAspect="Content" ObjectID="_1845288667" r:id="rId7"/>
         </w:object>
       </w:r>
       <w:r>
@@ -9555,7 +9555,7 @@
           <v:shape id="_x0000_i1027" type="#_x0000_t75" style="width:10.5pt;height:30.5pt" o:ole="">
             <v:imagedata r:id="rId8" o:title=""/>
           </v:shape>
-          <o:OLEObject Type="Embed" ProgID="Equation.3" ShapeID="_x0000_i1027" DrawAspect="Content" ObjectID="_1845276767" r:id="rId9"/>
+          <o:OLEObject Type="Embed" ProgID="Equation.3" ShapeID="_x0000_i1027" DrawAspect="Content" ObjectID="_1845288668" r:id="rId9"/>
         </w:object>
       </w:r>
       <w:r>
@@ -10071,7 +10071,7 @@
     <w:basedOn w:val="Norml"/>
     <w:uiPriority w:val="34"/>
     <w:qFormat/>
-    <w:rsid w:val="00EA6A48"/>
+    <w:rsid w:val="00461988"/>
     <w:pPr>
       <w:spacing w:after="200" w:line="240" w:lineRule="auto"/>
       <w:ind w:left="720"/>

</xml_diff>

<commit_message>
feat: add live logging and progress callbacks
</commit_message>
<xml_diff>
--- a/02_rendezett.docx
+++ b/02_rendezett.docx
@@ -8799,7 +8799,7 @@
           <v:shape id="_x0000_i1025" type="#_x0000_t75" style="width:10.5pt;height:30.5pt" o:ole="">
             <v:imagedata r:id="rId4" o:title=""/>
           </v:shape>
-          <o:OLEObject Type="Embed" ProgID="Equation.3" ShapeID="_x0000_i1025" DrawAspect="Content" ObjectID="_1845288666" r:id="rId5"/>
+          <o:OLEObject Type="Embed" ProgID="Equation.3" ShapeID="_x0000_i1025" DrawAspect="Content" ObjectID="_1846354219" r:id="rId5"/>
         </w:object>
       </w:r>
       <w:r>
@@ -9313,7 +9313,7 @@
           <v:shape id="_x0000_i1026" type="#_x0000_t75" style="width:10.5pt;height:30.5pt" o:ole="">
             <v:imagedata r:id="rId6" o:title=""/>
           </v:shape>
-          <o:OLEObject Type="Embed" ProgID="Equation.3" ShapeID="_x0000_i1026" DrawAspect="Content" ObjectID="_1845288667" r:id="rId7"/>
+          <o:OLEObject Type="Embed" ProgID="Equation.3" ShapeID="_x0000_i1026" DrawAspect="Content" ObjectID="_1846354220" r:id="rId7"/>
         </w:object>
       </w:r>
       <w:r>
@@ -9555,7 +9555,7 @@
           <v:shape id="_x0000_i1027" type="#_x0000_t75" style="width:10.5pt;height:30.5pt" o:ole="">
             <v:imagedata r:id="rId8" o:title=""/>
           </v:shape>
-          <o:OLEObject Type="Embed" ProgID="Equation.3" ShapeID="_x0000_i1027" DrawAspect="Content" ObjectID="_1845288668" r:id="rId9"/>
+          <o:OLEObject Type="Embed" ProgID="Equation.3" ShapeID="_x0000_i1027" DrawAspect="Content" ObjectID="_1846354221" r:id="rId9"/>
         </w:object>
       </w:r>
       <w:r>
@@ -10071,7 +10071,7 @@
     <w:basedOn w:val="Norml"/>
     <w:uiPriority w:val="34"/>
     <w:qFormat/>
-    <w:rsid w:val="00461988"/>
+    <w:rsid w:val="00590646"/>
     <w:pPr>
       <w:spacing w:after="200" w:line="240" w:lineRule="auto"/>
       <w:ind w:left="720"/>

</xml_diff>